<commit_message>
Carry schedule form checkbox selections into DOCX
</commit_message>
<xml_diff>
--- a/templates/Change_of_Schedule_Form_CRN_ONLY_v2.docx
+++ b/templates/Change_of_Schedule_Form_CRN_ONLY_v2.docx
@@ -133,42 +133,95 @@
             </w:tcBorders>
           </w:tcPr>
           <w:p>
-            <w:pPr>
+            <w:r>
+              <w:rPr>
+                <w:sz w:val="16"/>
+              </w:rPr>
+              <w:t>{{term_spring}} SPRING</w:t>
+            </w:r>
+          </w:p>
+        </w:tc>
+        <w:tc>
+          <w:tcPr>
+            <w:tcW w:w="3159" w:type="dxa"/>
+            <w:tcBorders>
+              <w:left w:val="single" w:sz="18" w:space="0" w:color="auto"/>
+              <w:right w:val="single" w:sz="18" w:space="0" w:color="auto"/>
+            </w:tcBorders>
+          </w:tcPr>
+          <w:p>
+            <w:r>
+              <w:rPr>
+                <w:sz w:val="16"/>
+              </w:rPr>
+              <w:t>{{division_chair}} DIVISION CHAIR</w:t>
+            </w:r>
+          </w:p>
+        </w:tc>
+        <w:tc>
+          <w:tcPr>
+            <w:tcW w:w="3377" w:type="dxa"/>
+            <w:tcBorders>
+              <w:top w:val="nil"/>
+              <w:left w:val="single" w:sz="18" w:space="0" w:color="auto"/>
+              <w:bottom w:val="nil"/>
+              <w:right w:val="nil"/>
+            </w:tcBorders>
+          </w:tcPr>
+          <w:p>
+            <w:pPr>
+              <w:jc w:val="right"/>
               <w:rPr>
                 <w:sz w:val="28"/>
                 <w:szCs w:val="28"/>
               </w:rPr>
             </w:pPr>
-            <w:sdt>
-              <w:sdtPr>
-                <w:rPr>
-                  <w:sz w:val="28"/>
-                  <w:szCs w:val="28"/>
-                </w:rPr>
-                <w:id w:val="1731259366"/>
-                <w14:checkbox>
-                  <w14:checked w14:val="0"/>
-                  <w14:checkedState w14:val="2612" w14:font="MS Gothic"/>
-                  <w14:uncheckedState w14:val="2610" w14:font="MS Gothic"/>
-                </w14:checkbox>
-              </w:sdtPr>
-              <w:sdtContent>
-                <w:r>
-                  <w:rPr>
-                    <w:rFonts w:ascii="MS Gothic" w:eastAsia="MS Gothic" w:hAnsi="MS Gothic" w:hint="eastAsia"/>
-                    <w:sz w:val="28"/>
-                    <w:szCs w:val="28"/>
-                  </w:rPr>
-                  <w:t>☐</w:t>
-                </w:r>
-              </w:sdtContent>
-            </w:sdt>
-            <w:r>
-              <w:rPr>
+            <w:r>
+              <w:rPr>
+                <w:b/>
                 <w:sz w:val="16"/>
                 <w:szCs w:val="28"/>
               </w:rPr>
-              <w:t xml:space="preserve"> SPRING </w:t>
+              <w:t>DATE PROCESSED</w:t>
+            </w:r>
+          </w:p>
+        </w:tc>
+        <w:tc>
+          <w:tcPr>
+            <w:tcW w:w="2137" w:type="dxa"/>
+            <w:tcBorders>
+              <w:top w:val="nil"/>
+              <w:left w:val="nil"/>
+              <w:bottom w:val="nil"/>
+              <w:right w:val="single" w:sz="18" w:space="0" w:color="auto"/>
+            </w:tcBorders>
+          </w:tcPr>
+          <w:p>
+            <w:r>
+              <w:rPr>
+                <w:sz w:val="16"/>
+              </w:rPr>
+              <w:t>{{date_processed}}</w:t>
+            </w:r>
+          </w:p>
+        </w:tc>
+      </w:tr>
+      <w:tr>
+        <w:tc>
+          <w:tcPr>
+            <w:tcW w:w="2081" w:type="dxa"/>
+            <w:tcBorders>
+              <w:top w:val="nil"/>
+              <w:bottom w:val="nil"/>
+              <w:right w:val="single" w:sz="18" w:space="0" w:color="auto"/>
+            </w:tcBorders>
+          </w:tcPr>
+          <w:p>
+            <w:r>
+              <w:rPr>
+                <w:sz w:val="16"/>
+              </w:rPr>
+              <w:t>{{term_summer}} SUMMER</w:t>
             </w:r>
           </w:p>
         </w:tc>
@@ -177,15 +230,16 @@
             <w:tcW w:w="3159" w:type="dxa"/>
             <w:tcBorders>
               <w:left w:val="single" w:sz="18" w:space="0" w:color="auto"/>
-              <w:right w:val="single" w:sz="18" w:space="0" w:color="auto"/>
-            </w:tcBorders>
-          </w:tcPr>
-          <w:p>
-            <w:r>
-              <w:rPr>
-                <w:sz w:val="16"/>
-              </w:rPr>
-              <w:t>{{division_chair}} DIVISION CHAIR</w:t>
+              <w:bottom w:val="single" w:sz="18" w:space="0" w:color="auto"/>
+              <w:right w:val="single" w:sz="18" w:space="0" w:color="auto"/>
+            </w:tcBorders>
+          </w:tcPr>
+          <w:p>
+            <w:r>
+              <w:rPr>
+                <w:sz w:val="16"/>
+              </w:rPr>
+              <w:t>{{area_dean}} AREA DEAN</w:t>
             </w:r>
           </w:p>
         </w:tc>
@@ -195,45 +249,36 @@
             <w:tcBorders>
               <w:top w:val="nil"/>
               <w:left w:val="single" w:sz="18" w:space="0" w:color="auto"/>
-              <w:bottom w:val="nil"/>
+              <w:bottom w:val="single" w:sz="18" w:space="0" w:color="auto"/>
               <w:right w:val="nil"/>
             </w:tcBorders>
           </w:tcPr>
           <w:p>
             <w:pPr>
-              <w:jc w:val="right"/>
               <w:rPr>
                 <w:sz w:val="28"/>
                 <w:szCs w:val="28"/>
               </w:rPr>
             </w:pPr>
-            <w:r>
-              <w:rPr>
-                <w:b/>
-                <w:sz w:val="16"/>
+          </w:p>
+        </w:tc>
+        <w:tc>
+          <w:tcPr>
+            <w:tcW w:w="2137" w:type="dxa"/>
+            <w:tcBorders>
+              <w:top w:val="nil"/>
+              <w:left w:val="nil"/>
+              <w:bottom w:val="single" w:sz="18" w:space="0" w:color="auto"/>
+              <w:right w:val="single" w:sz="18" w:space="0" w:color="auto"/>
+            </w:tcBorders>
+          </w:tcPr>
+          <w:p>
+            <w:pPr>
+              <w:rPr>
+                <w:sz w:val="28"/>
                 <w:szCs w:val="28"/>
               </w:rPr>
-              <w:t>DATE PROCESSED</w:t>
-            </w:r>
-          </w:p>
-        </w:tc>
-        <w:tc>
-          <w:tcPr>
-            <w:tcW w:w="2137" w:type="dxa"/>
-            <w:tcBorders>
-              <w:top w:val="nil"/>
-              <w:left w:val="nil"/>
-              <w:bottom w:val="nil"/>
-              <w:right w:val="single" w:sz="18" w:space="0" w:color="auto"/>
-            </w:tcBorders>
-          </w:tcPr>
-          <w:p>
-            <w:r>
-              <w:rPr>
-                <w:sz w:val="16"/>
-              </w:rPr>
-              <w:t>{{date_processed}}</w:t>
-            </w:r>
+            </w:pPr>
           </w:p>
         </w:tc>
       </w:tr>
@@ -243,55 +288,6 @@
             <w:tcW w:w="2081" w:type="dxa"/>
             <w:tcBorders>
               <w:top w:val="nil"/>
-              <w:bottom w:val="nil"/>
-              <w:right w:val="single" w:sz="18" w:space="0" w:color="auto"/>
-            </w:tcBorders>
-          </w:tcPr>
-          <w:p>
-            <w:pPr>
-              <w:rPr>
-                <w:sz w:val="28"/>
-                <w:szCs w:val="28"/>
-              </w:rPr>
-            </w:pPr>
-            <w:sdt>
-              <w:sdtPr>
-                <w:rPr>
-                  <w:sz w:val="28"/>
-                  <w:szCs w:val="28"/>
-                </w:rPr>
-                <w:id w:val="-1617447490"/>
-                <w14:checkbox>
-                  <w14:checked w14:val="0"/>
-                  <w14:checkedState w14:val="2612" w14:font="MS Gothic"/>
-                  <w14:uncheckedState w14:val="2610" w14:font="MS Gothic"/>
-                </w14:checkbox>
-              </w:sdtPr>
-              <w:sdtContent>
-                <w:r>
-                  <w:rPr>
-                    <w:rFonts w:ascii="MS Gothic" w:eastAsia="MS Gothic" w:hAnsi="MS Gothic" w:hint="eastAsia"/>
-                    <w:sz w:val="28"/>
-                    <w:szCs w:val="28"/>
-                  </w:rPr>
-                  <w:t>☐</w:t>
-                </w:r>
-              </w:sdtContent>
-            </w:sdt>
-            <w:r>
-              <w:rPr>
-                <w:sz w:val="16"/>
-                <w:szCs w:val="28"/>
-              </w:rPr>
-              <w:t xml:space="preserve"> SUMMER</w:t>
-            </w:r>
-          </w:p>
-        </w:tc>
-        <w:tc>
-          <w:tcPr>
-            <w:tcW w:w="3159" w:type="dxa"/>
-            <w:tcBorders>
-              <w:left w:val="single" w:sz="18" w:space="0" w:color="auto"/>
               <w:bottom w:val="single" w:sz="18" w:space="0" w:color="auto"/>
               <w:right w:val="single" w:sz="18" w:space="0" w:color="auto"/>
             </w:tcBorders>
@@ -301,96 +297,7 @@
               <w:rPr>
                 <w:sz w:val="16"/>
               </w:rPr>
-              <w:t>{{area_dean}} AREA DEAN</w:t>
-            </w:r>
-          </w:p>
-        </w:tc>
-        <w:tc>
-          <w:tcPr>
-            <w:tcW w:w="3377" w:type="dxa"/>
-            <w:tcBorders>
-              <w:top w:val="nil"/>
-              <w:left w:val="single" w:sz="18" w:space="0" w:color="auto"/>
-              <w:bottom w:val="single" w:sz="18" w:space="0" w:color="auto"/>
-              <w:right w:val="nil"/>
-            </w:tcBorders>
-          </w:tcPr>
-          <w:p>
-            <w:pPr>
-              <w:rPr>
-                <w:sz w:val="28"/>
-                <w:szCs w:val="28"/>
-              </w:rPr>
-            </w:pPr>
-          </w:p>
-        </w:tc>
-        <w:tc>
-          <w:tcPr>
-            <w:tcW w:w="2137" w:type="dxa"/>
-            <w:tcBorders>
-              <w:top w:val="nil"/>
-              <w:left w:val="nil"/>
-              <w:bottom w:val="single" w:sz="18" w:space="0" w:color="auto"/>
-              <w:right w:val="single" w:sz="18" w:space="0" w:color="auto"/>
-            </w:tcBorders>
-          </w:tcPr>
-          <w:p>
-            <w:pPr>
-              <w:rPr>
-                <w:sz w:val="28"/>
-                <w:szCs w:val="28"/>
-              </w:rPr>
-            </w:pPr>
-          </w:p>
-        </w:tc>
-      </w:tr>
-      <w:tr>
-        <w:tc>
-          <w:tcPr>
-            <w:tcW w:w="2081" w:type="dxa"/>
-            <w:tcBorders>
-              <w:top w:val="nil"/>
-              <w:bottom w:val="single" w:sz="18" w:space="0" w:color="auto"/>
-              <w:right w:val="single" w:sz="18" w:space="0" w:color="auto"/>
-            </w:tcBorders>
-          </w:tcPr>
-          <w:p>
-            <w:pPr>
-              <w:rPr>
-                <w:sz w:val="28"/>
-                <w:szCs w:val="28"/>
-              </w:rPr>
-            </w:pPr>
-            <w:sdt>
-              <w:sdtPr>
-                <w:rPr>
-                  <w:sz w:val="28"/>
-                  <w:szCs w:val="28"/>
-                </w:rPr>
-                <w:id w:val="731055305"/>
-                <w14:checkbox>
-                  <w14:checked w14:val="0"/>
-                  <w14:checkedState w14:val="2612" w14:font="MS Gothic"/>
-                  <w14:uncheckedState w14:val="2610" w14:font="MS Gothic"/>
-                </w14:checkbox>
-              </w:sdtPr>
-              <w:sdtContent>
-                <w:r>
-                  <w:rPr>
-                    <w:rFonts w:ascii="MS Gothic" w:eastAsia="MS Gothic" w:hAnsi="MS Gothic" w:hint="eastAsia"/>
-                    <w:sz w:val="28"/>
-                    <w:szCs w:val="28"/>
-                  </w:rPr>
-                  <w:t>☐</w:t>
-                </w:r>
-              </w:sdtContent>
-            </w:sdt>
-            <w:r>
-              <w:rPr>
-                <w:sz w:val="16"/>
-                <w:szCs w:val="28"/>
-              </w:rPr>
-              <w:t xml:space="preserve"> FALL </w:t>
+              <w:t>{{term_fall}} FALL</w:t>
             </w:r>
           </w:p>
         </w:tc>
@@ -405,217 +312,11 @@
             </w:tcBorders>
           </w:tcPr>
           <w:p>
-            <w:pPr>
-              <w:jc w:val="center"/>
-              <w:rPr>
-                <w:sz w:val="26"/>
-                <w:szCs w:val="26"/>
-              </w:rPr>
-            </w:pPr>
-            <w:r>
-              <w:rPr>
-                <w:b/>
-                <w:sz w:val="16"/>
-                <w:szCs w:val="26"/>
-              </w:rPr>
-              <w:t>CAMPUS</w:t>
-            </w:r>
-            <w:r>
-              <w:rPr>
-                <w:sz w:val="16"/>
-                <w:szCs w:val="26"/>
-              </w:rPr>
-              <w:t xml:space="preserve">  </w:t>
-            </w:r>
-            <w:r>
-              <w:rPr>
-                <w:sz w:val="16"/>
-                <w:szCs w:val="26"/>
-              </w:rPr>
-              <w:t xml:space="preserve"> </w:t>
-            </w:r>
-            <w:sdt>
-              <w:sdtPr>
-                <w:rPr>
-                  <w:sz w:val="26"/>
-                  <w:szCs w:val="26"/>
-                </w:rPr>
-                <w:id w:val="1974243518"/>
-                <w14:checkbox>
-                  <w14:checked w14:val="0"/>
-                  <w14:checkedState w14:val="2612" w14:font="MS Gothic"/>
-                  <w14:uncheckedState w14:val="2610" w14:font="MS Gothic"/>
-                </w14:checkbox>
-              </w:sdtPr>
-              <w:sdtContent>
-                <w:r>
-                  <w:rPr>
-                    <w:rFonts w:ascii="MS Gothic" w:eastAsia="MS Gothic" w:hAnsi="MS Gothic" w:hint="eastAsia"/>
-                    <w:sz w:val="26"/>
-                    <w:szCs w:val="26"/>
-                  </w:rPr>
-                  <w:t>☐</w:t>
-                </w:r>
-              </w:sdtContent>
-            </w:sdt>
-            <w:r>
-              <w:rPr>
-                <w:sz w:val="16"/>
-                <w:szCs w:val="26"/>
-              </w:rPr>
-              <w:t xml:space="preserve"> VISALIA  </w:t>
-            </w:r>
-            <w:sdt>
-              <w:sdtPr>
-                <w:rPr>
-                  <w:sz w:val="26"/>
-                  <w:szCs w:val="26"/>
-                </w:rPr>
-                <w:id w:val="-687059236"/>
-                <w14:checkbox>
-                  <w14:checked w14:val="0"/>
-                  <w14:checkedState w14:val="2612" w14:font="MS Gothic"/>
-                  <w14:uncheckedState w14:val="2610" w14:font="MS Gothic"/>
-                </w14:checkbox>
-              </w:sdtPr>
-              <w:sdtContent>
-                <w:r>
-                  <w:rPr>
-                    <w:rFonts w:ascii="MS Gothic" w:eastAsia="MS Gothic" w:hAnsi="MS Gothic" w:hint="eastAsia"/>
-                    <w:sz w:val="26"/>
-                    <w:szCs w:val="26"/>
-                  </w:rPr>
-                  <w:t>☐</w:t>
-                </w:r>
-              </w:sdtContent>
-            </w:sdt>
-            <w:r>
-              <w:rPr>
-                <w:sz w:val="16"/>
-                <w:szCs w:val="26"/>
-              </w:rPr>
-              <w:t xml:space="preserve"> TULARE </w:t>
-            </w:r>
-            <w:r>
-              <w:rPr>
-                <w:sz w:val="16"/>
-                <w:szCs w:val="26"/>
-              </w:rPr>
-              <w:t xml:space="preserve"> </w:t>
-            </w:r>
-            <w:sdt>
-              <w:sdtPr>
-                <w:rPr>
-                  <w:sz w:val="26"/>
-                  <w:szCs w:val="26"/>
-                </w:rPr>
-                <w:id w:val="1886051788"/>
-                <w14:checkbox>
-                  <w14:checked w14:val="0"/>
-                  <w14:checkedState w14:val="2612" w14:font="MS Gothic"/>
-                  <w14:uncheckedState w14:val="2610" w14:font="MS Gothic"/>
-                </w14:checkbox>
-              </w:sdtPr>
-              <w:sdtContent>
-                <w:r>
-                  <w:rPr>
-                    <w:rFonts w:ascii="MS Gothic" w:eastAsia="MS Gothic" w:hAnsi="MS Gothic" w:hint="eastAsia"/>
-                    <w:sz w:val="26"/>
-                    <w:szCs w:val="26"/>
-                  </w:rPr>
-                  <w:t>☐</w:t>
-                </w:r>
-              </w:sdtContent>
-            </w:sdt>
-            <w:r>
-              <w:rPr>
-                <w:sz w:val="16"/>
-                <w:szCs w:val="26"/>
-              </w:rPr>
-              <w:t xml:space="preserve"> HANFORD</w:t>
-            </w:r>
-            <w:r>
-              <w:rPr>
-                <w:sz w:val="16"/>
-                <w:szCs w:val="26"/>
-              </w:rPr>
-              <w:t xml:space="preserve"> </w:t>
-            </w:r>
-            <w:r>
-              <w:rPr>
-                <w:sz w:val="16"/>
-                <w:szCs w:val="26"/>
-              </w:rPr>
-              <w:t xml:space="preserve"> </w:t>
-            </w:r>
-            <w:sdt>
-              <w:sdtPr>
-                <w:rPr>
-                  <w:sz w:val="26"/>
-                  <w:szCs w:val="26"/>
-                </w:rPr>
-                <w:id w:val="1698730077"/>
-                <w14:checkbox>
-                  <w14:checked w14:val="0"/>
-                  <w14:checkedState w14:val="2612" w14:font="MS Gothic"/>
-                  <w14:uncheckedState w14:val="2610" w14:font="MS Gothic"/>
-                </w14:checkbox>
-              </w:sdtPr>
-              <w:sdtContent>
-                <w:r>
-                  <w:rPr>
-                    <w:rFonts w:ascii="MS Gothic" w:eastAsia="MS Gothic" w:hAnsi="MS Gothic" w:hint="eastAsia"/>
-                    <w:sz w:val="26"/>
-                    <w:szCs w:val="26"/>
-                  </w:rPr>
-                  <w:t>☐</w:t>
-                </w:r>
-              </w:sdtContent>
-            </w:sdt>
-            <w:r>
-              <w:rPr>
-                <w:sz w:val="16"/>
-                <w:szCs w:val="26"/>
-              </w:rPr>
-              <w:t xml:space="preserve"> ONLINE </w:t>
-            </w:r>
-            <w:r>
-              <w:rPr>
-                <w:sz w:val="16"/>
-                <w:szCs w:val="26"/>
-              </w:rPr>
-              <w:t xml:space="preserve"> </w:t>
-            </w:r>
-            <w:sdt>
-              <w:sdtPr>
-                <w:rPr>
-                  <w:sz w:val="26"/>
-                  <w:szCs w:val="26"/>
-                </w:rPr>
-                <w:id w:val="-48684988"/>
-                <w14:checkbox>
-                  <w14:checked w14:val="0"/>
-                  <w14:checkedState w14:val="2612" w14:font="MS Gothic"/>
-                  <w14:uncheckedState w14:val="2610" w14:font="MS Gothic"/>
-                </w14:checkbox>
-              </w:sdtPr>
-              <w:sdtContent>
-                <w:r>
-                  <w:rPr>
-                    <w:rFonts w:ascii="MS Gothic" w:eastAsia="MS Gothic" w:hAnsi="MS Gothic" w:hint="eastAsia"/>
-                    <w:sz w:val="26"/>
-                    <w:szCs w:val="26"/>
-                  </w:rPr>
-                  <w:t>☐</w:t>
-                </w:r>
-              </w:sdtContent>
-            </w:sdt>
-            <w:r>
-              <w:rPr>
-                <w:sz w:val="16"/>
-                <w:szCs w:val="26"/>
-              </w:rPr>
-              <w:t xml:space="preserve"> OFF-CAMPUS</w:t>
+            <w:r>
+              <w:rPr>
+                <w:sz w:val="16"/>
+              </w:rPr>
+              <w:t>CAMPUS  {{campus_visalia}} VISALIA   {{campus_tulare}} TULARE   {{campus_hanford}} HANFORD   {{campus_online}} ONLINE   {{campus_offcampus}} OFF-CAMPUS</w:t>
             </w:r>
           </w:p>
         </w:tc>
@@ -682,620 +383,37 @@
             </w:tcBorders>
           </w:tcPr>
           <w:p>
-            <w:pPr>
-              <w:spacing w:line="360" w:lineRule="auto"/>
-              <w:rPr>
-                <w:b/>
-              </w:rPr>
-            </w:pPr>
-            <w:sdt>
-              <w:sdtPr>
-                <w:rPr>
-                  <w:b/>
-                </w:rPr>
-                <w:id w:val="-1659220928"/>
-                <w14:checkbox>
-                  <w14:checked w14:val="0"/>
-                  <w14:checkedState w14:val="2612" w14:font="MS Gothic"/>
-                  <w14:uncheckedState w14:val="2610" w14:font="MS Gothic"/>
-                </w14:checkbox>
-              </w:sdtPr>
-              <w:sdtContent>
-                <w:r>
-                  <w:rPr>
-                    <w:rFonts w:ascii="MS Gothic" w:eastAsia="MS Gothic" w:hAnsi="MS Gothic" w:hint="eastAsia"/>
-                    <w:b/>
-                  </w:rPr>
-                  <w:t>☐</w:t>
-                </w:r>
-              </w:sdtContent>
-            </w:sdt>
-            <w:r>
-              <w:rPr>
-                <w:b/>
-                <w:sz w:val="16"/>
-              </w:rPr>
-              <w:t xml:space="preserve"> MODIFICATION</w:t>
-            </w:r>
-          </w:p>
-          <w:p>
-            <w:pPr>
-              <w:tabs>
-                <w:tab w:val="center" w:pos="1275"/>
-              </w:tabs>
-              <w:spacing w:line="360" w:lineRule="auto"/>
-              <w:rPr>
-                <w:b/>
-              </w:rPr>
-            </w:pPr>
-            <w:sdt>
-              <w:sdtPr>
-                <w:rPr>
-                  <w:b/>
-                </w:rPr>
-                <w:id w:val="-456876816"/>
-                <w14:checkbox>
-                  <w14:checked w14:val="0"/>
-                  <w14:checkedState w14:val="2612" w14:font="MS Gothic"/>
-                  <w14:uncheckedState w14:val="2610" w14:font="MS Gothic"/>
-                </w14:checkbox>
-              </w:sdtPr>
-              <w:sdtContent>
-                <w:r>
-                  <w:rPr>
-                    <w:rFonts w:ascii="MS Gothic" w:eastAsia="MS Gothic" w:hAnsi="MS Gothic" w:hint="eastAsia"/>
-                    <w:b/>
-                  </w:rPr>
-                  <w:t>☐</w:t>
-                </w:r>
-              </w:sdtContent>
-            </w:sdt>
-            <w:r>
-              <w:rPr>
-                <w:b/>
-                <w:sz w:val="16"/>
-              </w:rPr>
-              <w:t xml:space="preserve"> CANCEL </w:t>
-            </w:r>
-            <w:r>
-              <w:rPr>
-                <w:b/>
-                <w:sz w:val="16"/>
-              </w:rPr>
-              <w:t>–</w:t>
-            </w:r>
-            <w:r>
-              <w:rPr>
-                <w:b/>
-                <w:sz w:val="16"/>
-              </w:rPr>
-              <w:t xml:space="preserve"> </w:t>
-            </w:r>
-            <w:r>
-              <w:rPr>
-                <w:b/>
-                <w:sz w:val="16"/>
-              </w:rPr>
-              <w:t>CLERICAL</w:t>
-            </w:r>
-            <w:r>
-              <w:rPr>
-                <w:b/>
-                <w:sz w:val="16"/>
-              </w:rPr>
-              <w:t xml:space="preserve"> ERR.</w:t>
-            </w:r>
-          </w:p>
-          <w:p>
-            <w:pPr>
-              <w:tabs>
-                <w:tab w:val="center" w:pos="1275"/>
-              </w:tabs>
-              <w:spacing w:line="360" w:lineRule="auto"/>
-              <w:rPr>
-                <w:b/>
-              </w:rPr>
-            </w:pPr>
-            <w:sdt>
-              <w:sdtPr>
-                <w:rPr>
-                  <w:b/>
-                </w:rPr>
-                <w:id w:val="-940138395"/>
-                <w14:checkbox>
-                  <w14:checked w14:val="0"/>
-                  <w14:checkedState w14:val="2612" w14:font="MS Gothic"/>
-                  <w14:uncheckedState w14:val="2610" w14:font="MS Gothic"/>
-                </w14:checkbox>
-              </w:sdtPr>
-              <w:sdtContent>
-                <w:r>
-                  <w:rPr>
-                    <w:rFonts w:ascii="MS Gothic" w:eastAsia="MS Gothic" w:hAnsi="MS Gothic" w:hint="eastAsia"/>
-                    <w:b/>
-                  </w:rPr>
-                  <w:t>☐</w:t>
-                </w:r>
-              </w:sdtContent>
-            </w:sdt>
-            <w:r>
-              <w:rPr>
-                <w:b/>
-                <w:sz w:val="16"/>
-              </w:rPr>
-              <w:t xml:space="preserve"> CANCEL – SCHED. DEV.</w:t>
-            </w:r>
-          </w:p>
-          <w:p>
-            <w:pPr>
-              <w:tabs>
-                <w:tab w:val="center" w:pos="912"/>
-              </w:tabs>
-              <w:spacing w:line="360" w:lineRule="auto"/>
-              <w:rPr>
-                <w:b/>
-              </w:rPr>
-            </w:pPr>
-            <w:sdt>
-              <w:sdtPr>
-                <w:rPr>
-                  <w:b/>
-                </w:rPr>
-                <w:id w:val="318318825"/>
-                <w14:checkbox>
-                  <w14:checked w14:val="0"/>
-                  <w14:checkedState w14:val="2612" w14:font="MS Gothic"/>
-                  <w14:uncheckedState w14:val="2610" w14:font="MS Gothic"/>
-                </w14:checkbox>
-              </w:sdtPr>
-              <w:sdtContent>
-                <w:r>
-                  <w:rPr>
-                    <w:rFonts w:ascii="MS Gothic" w:eastAsia="MS Gothic" w:hAnsi="MS Gothic" w:hint="eastAsia"/>
-                    <w:b/>
-                  </w:rPr>
-                  <w:t>☐</w:t>
-                </w:r>
-              </w:sdtContent>
-            </w:sdt>
-            <w:r>
-              <w:rPr>
-                <w:b/>
-                <w:sz w:val="16"/>
-              </w:rPr>
-              <w:t xml:space="preserve"> CANCEL – REBUILD</w:t>
-            </w:r>
-          </w:p>
-          <w:p>
-            <w:pPr>
-              <w:tabs>
-                <w:tab w:val="center" w:pos="912"/>
-              </w:tabs>
-              <w:spacing w:line="360" w:lineRule="auto"/>
-              <w:rPr>
-                <w:b/>
-              </w:rPr>
-            </w:pPr>
-            <w:sdt>
-              <w:sdtPr>
-                <w:rPr>
-                  <w:b/>
-                </w:rPr>
-                <w:id w:val="-435441013"/>
-                <w14:checkbox>
-                  <w14:checked w14:val="0"/>
-                  <w14:checkedState w14:val="2612" w14:font="MS Gothic"/>
-                  <w14:uncheckedState w14:val="2610" w14:font="MS Gothic"/>
-                </w14:checkbox>
-              </w:sdtPr>
-              <w:sdtContent>
-                <w:r>
-                  <w:rPr>
-                    <w:rFonts w:ascii="MS Gothic" w:eastAsia="MS Gothic" w:hAnsi="MS Gothic" w:hint="eastAsia"/>
-                    <w:b/>
-                  </w:rPr>
-                  <w:t>☐</w:t>
-                </w:r>
-              </w:sdtContent>
-            </w:sdt>
-            <w:r>
-              <w:rPr>
-                <w:b/>
-                <w:sz w:val="16"/>
-              </w:rPr>
-              <w:t xml:space="preserve"> CANCEL – </w:t>
-            </w:r>
-            <w:r>
-              <w:rPr>
-                <w:b/>
-                <w:sz w:val="16"/>
-              </w:rPr>
-              <w:t>NO STAFF</w:t>
-            </w:r>
-          </w:p>
-          <w:p>
-            <w:pPr>
-              <w:tabs>
-                <w:tab w:val="center" w:pos="1275"/>
-              </w:tabs>
-              <w:spacing w:line="360" w:lineRule="auto"/>
-              <w:rPr>
-                <w:b/>
-              </w:rPr>
-            </w:pPr>
-            <w:sdt>
-              <w:sdtPr>
-                <w:rPr>
-                  <w:b/>
-                </w:rPr>
-                <w:id w:val="-1753806841"/>
-                <w14:checkbox>
-                  <w14:checked w14:val="0"/>
-                  <w14:checkedState w14:val="2612" w14:font="MS Gothic"/>
-                  <w14:uncheckedState w14:val="2610" w14:font="MS Gothic"/>
-                </w14:checkbox>
-              </w:sdtPr>
-              <w:sdtContent>
-                <w:r>
-                  <w:rPr>
-                    <w:rFonts w:ascii="MS Gothic" w:eastAsia="MS Gothic" w:hAnsi="MS Gothic" w:hint="eastAsia"/>
-                    <w:b/>
-                  </w:rPr>
-                  <w:t>☐</w:t>
-                </w:r>
-              </w:sdtContent>
-            </w:sdt>
-            <w:r>
-              <w:rPr>
-                <w:b/>
-                <w:sz w:val="16"/>
-              </w:rPr>
-              <w:t xml:space="preserve"> CANCEL – LOW ENROLL</w:t>
-            </w:r>
-          </w:p>
-          <w:p>
-            <w:pPr>
-              <w:spacing w:line="276" w:lineRule="auto"/>
-              <w:rPr>
-                <w:b/>
-                <w:sz w:val="16"/>
-                <w:szCs w:val="16"/>
-              </w:rPr>
-            </w:pPr>
-            <w:r>
-              <w:rPr>
-                <w:b/>
-                <w:sz w:val="16"/>
-                <w:szCs w:val="16"/>
-              </w:rPr>
-              <w:t xml:space="preserve">         ____ # ENROLLED</w:t>
-            </w:r>
-          </w:p>
-          <w:p>
-            <w:pPr>
-              <w:spacing w:line="276" w:lineRule="auto"/>
-              <w:rPr>
-                <w:b/>
-                <w:sz w:val="16"/>
-                <w:szCs w:val="16"/>
-              </w:rPr>
-            </w:pPr>
-            <w:r>
-              <w:rPr>
-                <w:b/>
-                <w:sz w:val="16"/>
-                <w:szCs w:val="16"/>
-              </w:rPr>
-              <w:t xml:space="preserve">         ____ ADJ. </w:t>
-            </w:r>
-            <w:r>
-              <w:rPr>
-                <w:b/>
-                <w:sz w:val="16"/>
-                <w:szCs w:val="16"/>
-              </w:rPr>
-              <w:t xml:space="preserve">CANCELED </w:t>
-            </w:r>
-          </w:p>
-          <w:p>
-            <w:pPr>
-              <w:spacing w:line="276" w:lineRule="auto"/>
-              <w:rPr>
-                <w:b/>
-                <w:sz w:val="16"/>
-                <w:szCs w:val="16"/>
-              </w:rPr>
-            </w:pPr>
-            <w:r>
-              <w:rPr>
-                <w:b/>
-                <w:sz w:val="16"/>
-                <w:szCs w:val="16"/>
-              </w:rPr>
-              <w:t xml:space="preserve">         CLASS </w:t>
-            </w:r>
-            <w:r>
-              <w:rPr>
-                <w:b/>
-                <w:sz w:val="16"/>
-                <w:szCs w:val="16"/>
-              </w:rPr>
-              <w:t xml:space="preserve">COMP. FORM </w:t>
-            </w:r>
-          </w:p>
-          <w:p>
-            <w:pPr>
-              <w:spacing w:line="276" w:lineRule="auto"/>
-              <w:rPr>
-                <w:b/>
-                <w:sz w:val="16"/>
-                <w:szCs w:val="16"/>
-              </w:rPr>
-            </w:pPr>
-            <w:r>
-              <w:rPr>
-                <w:b/>
-                <w:sz w:val="16"/>
-                <w:szCs w:val="16"/>
-              </w:rPr>
-              <w:t xml:space="preserve">         </w:t>
-            </w:r>
-            <w:r>
-              <w:rPr>
-                <w:b/>
-                <w:sz w:val="16"/>
-                <w:szCs w:val="16"/>
-              </w:rPr>
-              <w:t xml:space="preserve">SENT TO </w:t>
-            </w:r>
-            <w:r>
-              <w:rPr>
-                <w:b/>
-                <w:sz w:val="16"/>
-                <w:szCs w:val="16"/>
-              </w:rPr>
-              <w:t>ACAD. SERV.</w:t>
-            </w:r>
-          </w:p>
-          <w:p>
-            <w:pPr>
-              <w:spacing w:line="360" w:lineRule="auto"/>
-              <w:rPr>
-                <w:b/>
-              </w:rPr>
-            </w:pPr>
-            <w:sdt>
-              <w:sdtPr>
-                <w:rPr>
-                  <w:b/>
-                </w:rPr>
-                <w:id w:val="1713848716"/>
-                <w14:checkbox>
-                  <w14:checked w14:val="0"/>
-                  <w14:checkedState w14:val="2612" w14:font="MS Gothic"/>
-                  <w14:uncheckedState w14:val="2610" w14:font="MS Gothic"/>
-                </w14:checkbox>
-              </w:sdtPr>
-              <w:sdtContent>
-                <w:r>
-                  <w:rPr>
-                    <w:rFonts w:ascii="MS Gothic" w:eastAsia="MS Gothic" w:hAnsi="MS Gothic" w:hint="eastAsia"/>
-                    <w:b/>
-                  </w:rPr>
-                  <w:t>☐</w:t>
-                </w:r>
-              </w:sdtContent>
-            </w:sdt>
-            <w:r>
-              <w:rPr>
-                <w:b/>
-                <w:sz w:val="16"/>
-              </w:rPr>
-              <w:t xml:space="preserve"> UN-CANCEL</w:t>
-            </w:r>
-          </w:p>
-          <w:p>
-            <w:pPr>
-              <w:spacing w:line="360" w:lineRule="auto"/>
-              <w:rPr>
-                <w:b/>
-              </w:rPr>
-            </w:pPr>
-            <w:sdt>
-              <w:sdtPr>
-                <w:rPr>
-                  <w:b/>
-                </w:rPr>
-                <w:id w:val="-1614511452"/>
-                <w14:checkbox>
-                  <w14:checked w14:val="0"/>
-                  <w14:checkedState w14:val="2612" w14:font="MS Gothic"/>
-                  <w14:uncheckedState w14:val="2610" w14:font="MS Gothic"/>
-                </w14:checkbox>
-              </w:sdtPr>
-              <w:sdtContent>
-                <w:r>
-                  <w:rPr>
-                    <w:rFonts w:ascii="MS Gothic" w:eastAsia="MS Gothic" w:hAnsi="MS Gothic" w:hint="eastAsia"/>
-                    <w:b/>
-                  </w:rPr>
-                  <w:t>☐</w:t>
-                </w:r>
-              </w:sdtContent>
-            </w:sdt>
-            <w:r>
-              <w:rPr>
-                <w:b/>
-                <w:sz w:val="16"/>
-              </w:rPr>
-              <w:t xml:space="preserve"> ADDITION</w:t>
-            </w:r>
-          </w:p>
-          <w:p>
-            <w:pPr>
-              <w:spacing w:line="360" w:lineRule="auto"/>
-              <w:rPr>
-                <w:b/>
-              </w:rPr>
-            </w:pPr>
-            <w:sdt>
-              <w:sdtPr>
-                <w:rPr>
-                  <w:b/>
-                </w:rPr>
-                <w:id w:val="-724291281"/>
-                <w14:checkbox>
-                  <w14:checked w14:val="0"/>
-                  <w14:checkedState w14:val="2612" w14:font="MS Gothic"/>
-                  <w14:uncheckedState w14:val="2610" w14:font="MS Gothic"/>
-                </w14:checkbox>
-              </w:sdtPr>
-              <w:sdtContent>
-                <w:r>
-                  <w:rPr>
-                    <w:rFonts w:ascii="MS Gothic" w:eastAsia="MS Gothic" w:hAnsi="MS Gothic" w:hint="eastAsia"/>
-                    <w:b/>
-                  </w:rPr>
-                  <w:t>☐</w:t>
-                </w:r>
-              </w:sdtContent>
-            </w:sdt>
-            <w:r>
-              <w:rPr>
-                <w:b/>
-                <w:sz w:val="16"/>
-              </w:rPr>
-              <w:t xml:space="preserve"> ACTIVATION</w:t>
-            </w:r>
-          </w:p>
-          <w:p>
-            <w:pPr>
-              <w:spacing w:line="360" w:lineRule="auto"/>
-              <w:rPr>
-                <w:b/>
-              </w:rPr>
-            </w:pPr>
-            <w:sdt>
-              <w:sdtPr>
-                <w:rPr>
-                  <w:b/>
-                </w:rPr>
-                <w:id w:val="-2105177787"/>
-                <w14:checkbox>
-                  <w14:checked w14:val="0"/>
-                  <w14:checkedState w14:val="2612" w14:font="MS Gothic"/>
-                  <w14:uncheckedState w14:val="2610" w14:font="MS Gothic"/>
-                </w14:checkbox>
-              </w:sdtPr>
-              <w:sdtContent>
-                <w:r>
-                  <w:rPr>
-                    <w:rFonts w:ascii="MS Gothic" w:eastAsia="MS Gothic" w:hAnsi="MS Gothic" w:hint="eastAsia"/>
-                    <w:b/>
-                  </w:rPr>
-                  <w:t>☐</w:t>
-                </w:r>
-              </w:sdtContent>
-            </w:sdt>
-            <w:r>
-              <w:rPr>
-                <w:b/>
-                <w:sz w:val="16"/>
-              </w:rPr>
-              <w:t xml:space="preserve"> INACTIVATE</w:t>
-            </w:r>
-          </w:p>
-          <w:p>
-            <w:pPr>
-              <w:spacing w:line="360" w:lineRule="auto"/>
-              <w:rPr>
-                <w:b/>
-                <w:sz w:val="16"/>
-                <w:szCs w:val="16"/>
-              </w:rPr>
-            </w:pPr>
-            <w:r>
-              <w:rPr>
-                <w:b/>
-                <w:sz w:val="16"/>
-                <w:szCs w:val="16"/>
-              </w:rPr>
-              <w:t>VISIBLE IN CLASS SEARCH?</w:t>
-            </w:r>
-          </w:p>
-          <w:p>
-            <w:pPr>
-              <w:spacing w:line="360" w:lineRule="auto"/>
-              <w:rPr>
-                <w:sz w:val="20"/>
-                <w:szCs w:val="16"/>
-              </w:rPr>
-            </w:pPr>
-            <w:sdt>
-              <w:sdtPr>
-                <w:rPr>
-                  <w:b/>
-                </w:rPr>
-                <w:id w:val="1182167836"/>
-                <w14:checkbox>
-                  <w14:checked w14:val="0"/>
-                  <w14:checkedState w14:val="2612" w14:font="MS Gothic"/>
-                  <w14:uncheckedState w14:val="2610" w14:font="MS Gothic"/>
-                </w14:checkbox>
-              </w:sdtPr>
-              <w:sdtContent>
-                <w:r>
-                  <w:rPr>
-                    <w:rFonts w:ascii="MS Gothic" w:eastAsia="MS Gothic" w:hAnsi="MS Gothic" w:hint="eastAsia"/>
-                    <w:b/>
-                  </w:rPr>
-                  <w:t>☐</w:t>
-                </w:r>
-              </w:sdtContent>
-            </w:sdt>
-            <w:r>
-              <w:rPr>
-                <w:b/>
-                <w:sz w:val="16"/>
-              </w:rPr>
-              <w:t xml:space="preserve"> </w:t>
-            </w:r>
-            <w:r>
-              <w:rPr>
-                <w:b/>
-                <w:sz w:val="16"/>
-                <w:szCs w:val="16"/>
-              </w:rPr>
-              <w:t xml:space="preserve">YES  </w:t>
-            </w:r>
-            <w:sdt>
-              <w:sdtPr>
-                <w:rPr>
-                  <w:b/>
-                </w:rPr>
-                <w:id w:val="567618967"/>
-                <w14:checkbox>
-                  <w14:checked w14:val="0"/>
-                  <w14:checkedState w14:val="2612" w14:font="MS Gothic"/>
-                  <w14:uncheckedState w14:val="2610" w14:font="MS Gothic"/>
-                </w14:checkbox>
-              </w:sdtPr>
-              <w:sdtContent>
-                <w:r>
-                  <w:rPr>
-                    <w:rFonts w:ascii="MS Gothic" w:eastAsia="MS Gothic" w:hAnsi="MS Gothic" w:hint="eastAsia"/>
-                    <w:b/>
-                  </w:rPr>
-                  <w:t>☐</w:t>
-                </w:r>
-              </w:sdtContent>
-            </w:sdt>
-            <w:r>
-              <w:rPr>
-                <w:b/>
-                <w:sz w:val="16"/>
-              </w:rPr>
-              <w:t xml:space="preserve"> NO</w:t>
+            <w:r>
+              <w:rPr>
+                <w:sz w:val="16"/>
+              </w:rPr>
+              <w:t>{{action_modification}} MODIFICATION</w:t>
+              <w:br/>
+              <w:t>{{action_cancel_clerical}} CANCEL - CLERICAL ERR.</w:t>
+              <w:br/>
+              <w:t>{{action_cancel_sched_dev}} CANCEL - SCHED. DEV.</w:t>
+              <w:br/>
+              <w:t>{{action_cancel_rebuild}} CANCEL - REBUILD</w:t>
+              <w:br/>
+              <w:t>{{action_cancel_no_staff}} CANCEL - NO STAFF</w:t>
+              <w:br/>
+              <w:t>{{action_cancel_low_enroll}} CANCEL - LOW ENROLL</w:t>
+              <w:br/>
+              <w:t>{{num_enrolled}} # ENROLLED</w:t>
+              <w:br/>
+              <w:t>{{adj_canceled}} ADJ. CANCELED</w:t>
+              <w:br/>
+              <w:t>CLASS COMP. FORM SENT TO ACAD. SERV.  {{class_comp_yes}} YES  {{class_comp_no}} NO</w:t>
+              <w:br/>
+              <w:t>{{action_uncancel}} UN-CANCEL</w:t>
+              <w:br/>
+              <w:t>{{action_addition}} ADDITION</w:t>
+              <w:br/>
+              <w:t>{{action_activation}} ACTIVATION</w:t>
+              <w:br/>
+              <w:t>{{action_inactivate}} INACTIVATE</w:t>
+              <w:br/>
+              <w:t>VISIBLE IN CLASS SEARCH? {{visible_yes}} YES  {{visible_no}} NO</w:t>
             </w:r>
           </w:p>
         </w:tc>

</xml_diff>

<commit_message>
Export changed-to schedule form details
</commit_message>
<xml_diff>
--- a/templates/Change_of_Schedule_Form_CRN_ONLY_v2.docx
+++ b/templates/Change_of_Schedule_Form_CRN_ONLY_v2.docx
@@ -574,7 +574,11 @@
               <w:right w:val="single" w:sz="4" w:space="0" w:color="auto"/>
             </w:tcBorders>
           </w:tcPr>
-          <w:p/>
+          <w:p>
+            <w:r>
+              <w:t>{{crn_changed}}</w:t>
+            </w:r>
+          </w:p>
         </w:tc>
         <w:tc>
           <w:tcPr>
@@ -586,7 +590,11 @@
               <w:right w:val="single" w:sz="18" w:space="0" w:color="auto"/>
             </w:tcBorders>
           </w:tcPr>
-          <w:p/>
+          <w:p>
+            <w:r>
+              <w:t>{{crn_done}}</w:t>
+            </w:r>
+          </w:p>
         </w:tc>
       </w:tr>
       <w:tr>
@@ -655,7 +663,11 @@
               <w:right w:val="single" w:sz="4" w:space="0" w:color="auto"/>
             </w:tcBorders>
           </w:tcPr>
-          <w:p/>
+          <w:p>
+            <w:r>
+              <w:t>{{subject_course_changed}}</w:t>
+            </w:r>
+          </w:p>
         </w:tc>
         <w:tc>
           <w:tcPr>
@@ -667,7 +679,11 @@
               <w:right w:val="single" w:sz="18" w:space="0" w:color="auto"/>
             </w:tcBorders>
           </w:tcPr>
-          <w:p/>
+          <w:p>
+            <w:r>
+              <w:t>{{subject_course_done}}</w:t>
+            </w:r>
+          </w:p>
         </w:tc>
       </w:tr>
       <w:tr>
@@ -751,7 +767,11 @@
               <w:right w:val="single" w:sz="4" w:space="0" w:color="auto"/>
             </w:tcBorders>
           </w:tcPr>
-          <w:p/>
+          <w:p>
+            <w:r>
+              <w:t>{{times_changed}}</w:t>
+            </w:r>
+          </w:p>
         </w:tc>
         <w:tc>
           <w:tcPr>
@@ -763,7 +783,11 @@
               <w:right w:val="single" w:sz="18" w:space="0" w:color="auto"/>
             </w:tcBorders>
           </w:tcPr>
-          <w:p/>
+          <w:p>
+            <w:r>
+              <w:t>{{times_done}}</w:t>
+            </w:r>
+          </w:p>
         </w:tc>
       </w:tr>
       <w:tr>
@@ -850,7 +874,11 @@
               <w:right w:val="single" w:sz="4" w:space="0" w:color="auto"/>
             </w:tcBorders>
           </w:tcPr>
-          <w:p/>
+          <w:p>
+            <w:r>
+              <w:t>{{days_changed}}</w:t>
+            </w:r>
+          </w:p>
         </w:tc>
         <w:tc>
           <w:tcPr>
@@ -862,7 +890,11 @@
               <w:right w:val="single" w:sz="18" w:space="0" w:color="auto"/>
             </w:tcBorders>
           </w:tcPr>
-          <w:p/>
+          <w:p>
+            <w:r>
+              <w:t>{{days_done}}</w:t>
+            </w:r>
+          </w:p>
         </w:tc>
       </w:tr>
       <w:tr>
@@ -931,7 +963,11 @@
               <w:right w:val="single" w:sz="4" w:space="0" w:color="auto"/>
             </w:tcBorders>
           </w:tcPr>
-          <w:p/>
+          <w:p>
+            <w:r>
+              <w:t>{{short_dates_changed}}</w:t>
+            </w:r>
+          </w:p>
         </w:tc>
         <w:tc>
           <w:tcPr>
@@ -943,7 +979,11 @@
               <w:right w:val="single" w:sz="18" w:space="0" w:color="auto"/>
             </w:tcBorders>
           </w:tcPr>
-          <w:p/>
+          <w:p>
+            <w:r>
+              <w:t>{{short_dates_done}}</w:t>
+            </w:r>
+          </w:p>
         </w:tc>
       </w:tr>
       <w:tr>
@@ -1012,7 +1052,11 @@
               <w:right w:val="single" w:sz="4" w:space="0" w:color="auto"/>
             </w:tcBorders>
           </w:tcPr>
-          <w:p/>
+          <w:p>
+            <w:r>
+              <w:t>{{weeks_changed}}</w:t>
+            </w:r>
+          </w:p>
         </w:tc>
         <w:tc>
           <w:tcPr>
@@ -1024,7 +1068,11 @@
               <w:right w:val="single" w:sz="18" w:space="0" w:color="auto"/>
             </w:tcBorders>
           </w:tcPr>
-          <w:p/>
+          <w:p>
+            <w:r>
+              <w:t>{{weeks_done}}</w:t>
+            </w:r>
+          </w:p>
         </w:tc>
       </w:tr>
       <w:tr>
@@ -1093,7 +1141,11 @@
               <w:right w:val="single" w:sz="4" w:space="0" w:color="auto"/>
             </w:tcBorders>
           </w:tcPr>
-          <w:p/>
+          <w:p>
+            <w:r>
+              <w:t>{{units_changed}}</w:t>
+            </w:r>
+          </w:p>
         </w:tc>
         <w:tc>
           <w:tcPr>
@@ -1105,7 +1157,11 @@
               <w:right w:val="single" w:sz="18" w:space="0" w:color="auto"/>
             </w:tcBorders>
           </w:tcPr>
-          <w:p/>
+          <w:p>
+            <w:r>
+              <w:t>{{units_done}}</w:t>
+            </w:r>
+          </w:p>
         </w:tc>
       </w:tr>
       <w:tr>
@@ -1174,7 +1230,11 @@
               <w:right w:val="single" w:sz="4" w:space="0" w:color="auto"/>
             </w:tcBorders>
           </w:tcPr>
-          <w:p/>
+          <w:p>
+            <w:r>
+              <w:t>{{capacity_changed}}</w:t>
+            </w:r>
+          </w:p>
         </w:tc>
         <w:tc>
           <w:tcPr>
@@ -1186,7 +1246,11 @@
               <w:right w:val="single" w:sz="18" w:space="0" w:color="auto"/>
             </w:tcBorders>
           </w:tcPr>
-          <w:p/>
+          <w:p>
+            <w:r>
+              <w:t>{{capacity_done}}</w:t>
+            </w:r>
+          </w:p>
         </w:tc>
       </w:tr>
       <w:tr>
@@ -1270,7 +1334,11 @@
               <w:right w:val="single" w:sz="4" w:space="0" w:color="auto"/>
             </w:tcBorders>
           </w:tcPr>
-          <w:p/>
+          <w:p>
+            <w:r>
+              <w:t>{{building_changed}}</w:t>
+            </w:r>
+          </w:p>
         </w:tc>
         <w:tc>
           <w:tcPr>
@@ -1282,7 +1350,11 @@
               <w:right w:val="single" w:sz="18" w:space="0" w:color="auto"/>
             </w:tcBorders>
           </w:tcPr>
-          <w:p/>
+          <w:p>
+            <w:r>
+              <w:t>{{building_done}}</w:t>
+            </w:r>
+          </w:p>
         </w:tc>
       </w:tr>
       <w:tr>
@@ -1359,7 +1431,11 @@
               <w:right w:val="single" w:sz="4" w:space="0" w:color="auto"/>
             </w:tcBorders>
           </w:tcPr>
-          <w:p/>
+          <w:p>
+            <w:r>
+              <w:t>{{room_changed}}</w:t>
+            </w:r>
+          </w:p>
         </w:tc>
         <w:tc>
           <w:tcPr>
@@ -1371,7 +1447,11 @@
               <w:right w:val="single" w:sz="18" w:space="0" w:color="auto"/>
             </w:tcBorders>
           </w:tcPr>
-          <w:p/>
+          <w:p>
+            <w:r>
+              <w:t>{{room_done}}</w:t>
+            </w:r>
+          </w:p>
         </w:tc>
       </w:tr>
       <w:tr>
@@ -1447,7 +1527,11 @@
               <w:right w:val="single" w:sz="4" w:space="0" w:color="auto"/>
             </w:tcBorders>
           </w:tcPr>
-          <w:p/>
+          <w:p>
+            <w:r>
+              <w:t>{{instructor_full_changed}}</w:t>
+            </w:r>
+          </w:p>
         </w:tc>
         <w:tc>
           <w:tcPr>
@@ -1459,7 +1543,11 @@
               <w:right w:val="single" w:sz="18" w:space="0" w:color="auto"/>
             </w:tcBorders>
           </w:tcPr>
-          <w:p/>
+          <w:p>
+            <w:r>
+              <w:t>{{instructor_full_done}}</w:t>
+            </w:r>
+          </w:p>
         </w:tc>
       </w:tr>
       <w:tr>
@@ -1535,7 +1623,11 @@
               <w:right w:val="single" w:sz="4" w:space="0" w:color="auto"/>
             </w:tcBorders>
           </w:tcPr>
-          <w:p/>
+          <w:p>
+            <w:r>
+              <w:t>{{banner_id_changed}}</w:t>
+            </w:r>
+          </w:p>
         </w:tc>
         <w:tc>
           <w:tcPr>
@@ -1547,7 +1639,11 @@
               <w:right w:val="single" w:sz="18" w:space="0" w:color="auto"/>
             </w:tcBorders>
           </w:tcPr>
-          <w:p/>
+          <w:p>
+            <w:r>
+              <w:t>{{banner_id_done}}</w:t>
+            </w:r>
+          </w:p>
         </w:tc>
       </w:tr>
       <w:tr>
@@ -1626,7 +1722,11 @@
               <w:right w:val="single" w:sz="4" w:space="0" w:color="auto"/>
             </w:tcBorders>
           </w:tcPr>
-          <w:p/>
+          <w:p>
+            <w:r>
+              <w:t>{{split_instructor_changed}}</w:t>
+            </w:r>
+          </w:p>
         </w:tc>
         <w:tc>
           <w:tcPr>
@@ -1638,7 +1738,11 @@
               <w:right w:val="single" w:sz="18" w:space="0" w:color="auto"/>
             </w:tcBorders>
           </w:tcPr>
-          <w:p/>
+          <w:p>
+            <w:r>
+              <w:t>{{split_instructor_done}}</w:t>
+            </w:r>
+          </w:p>
         </w:tc>
       </w:tr>
       <w:tr>
@@ -1717,7 +1821,11 @@
               <w:right w:val="single" w:sz="4" w:space="0" w:color="auto"/>
             </w:tcBorders>
           </w:tcPr>
-          <w:p/>
+          <w:p>
+            <w:r>
+              <w:t>{{split_banner_id_changed}}</w:t>
+            </w:r>
+          </w:p>
         </w:tc>
         <w:tc>
           <w:tcPr>
@@ -1729,7 +1837,11 @@
               <w:right w:val="single" w:sz="18" w:space="0" w:color="auto"/>
             </w:tcBorders>
           </w:tcPr>
-          <w:p/>
+          <w:p>
+            <w:r>
+              <w:t>{{split_banner_id_done}}</w:t>
+            </w:r>
+          </w:p>
         </w:tc>
       </w:tr>
     </w:tbl>

</xml_diff>